<commit_message>
New Changes and PDF generated
</commit_message>
<xml_diff>
--- a/Resume.docx
+++ b/Resume.docx
@@ -419,7 +419,7 @@
     </w:p>
     <w:p>
       <w:pPr>
-        <w:spacing w:after="0" w:line="480" w:lineRule="auto"/>
+        <w:spacing w:after="0" w:line="240" w:lineRule="auto"/>
         <w:rPr>
           <w:sz w:val="20"/>
           <w:szCs w:val="20"/>
@@ -468,6 +468,20 @@
           <w:szCs w:val="20"/>
         </w:rPr>
         <w:t>, CSS and HTML</w:t>
+      </w:r>
+      <w:r>
+        <w:rPr>
+          <w:sz w:val="20"/>
+          <w:szCs w:val="20"/>
+        </w:rPr>
+        <w:t xml:space="preserve">. </w:t>
+      </w:r>
+      <w:r>
+        <w:rPr>
+          <w:sz w:val="20"/>
+          <w:szCs w:val="20"/>
+        </w:rPr>
+        <w:t>Seeking the opportunity to increase the client base as PHP Developer at Super Software.</w:t>
       </w:r>
     </w:p>
     <w:p>
@@ -611,7 +625,28 @@
           <w:sz w:val="20"/>
           <w:szCs w:val="20"/>
         </w:rPr>
-        <w:t xml:space="preserve">PHP, OOPS, </w:t>
+        <w:t>PHP,</w:t>
+      </w:r>
+      <w:r>
+        <w:rPr>
+          <w:sz w:val="20"/>
+          <w:szCs w:val="20"/>
+        </w:rPr>
+        <w:t xml:space="preserve"> MVC Frameworks,</w:t>
+      </w:r>
+      <w:r>
+        <w:rPr>
+          <w:sz w:val="20"/>
+          <w:szCs w:val="20"/>
+        </w:rPr>
+        <w:t xml:space="preserve"> Web APIs,</w:t>
+      </w:r>
+      <w:r>
+        <w:rPr>
+          <w:sz w:val="20"/>
+          <w:szCs w:val="20"/>
+        </w:rPr>
+        <w:t xml:space="preserve"> OOPS, </w:t>
       </w:r>
       <w:proofErr w:type="gramStart"/>
       <w:r>
@@ -708,6 +743,26 @@
           <w:u w:val="single"/>
         </w:rPr>
         <w:t>TRENGTH</w:t>
+      </w:r>
+      <w:r>
+        <w:rPr>
+          <w:b/>
+          <w:bCs/>
+          <w:sz w:val="28"/>
+          <w:szCs w:val="28"/>
+          <w:u w:val="single"/>
+        </w:rPr>
+        <w:tab/>
+      </w:r>
+      <w:r>
+        <w:rPr>
+          <w:b/>
+          <w:bCs/>
+          <w:sz w:val="28"/>
+          <w:szCs w:val="28"/>
+          <w:u w:val="single"/>
+        </w:rPr>
+        <w:tab/>
       </w:r>
       <w:r>
         <w:rPr>
@@ -859,7 +914,7 @@
           <w:sz w:val="20"/>
           <w:szCs w:val="20"/>
         </w:rPr>
-        <w:t xml:space="preserve">Service Titan </w:t>
+        <w:t>Microsoft Dynamics CRM</w:t>
       </w:r>
     </w:p>
     <w:p>
@@ -880,7 +935,7 @@
           <w:sz w:val="20"/>
           <w:szCs w:val="20"/>
         </w:rPr>
-        <w:t>Microsoft Dynamics CRM</w:t>
+        <w:t xml:space="preserve">Service Titan </w:t>
       </w:r>
     </w:p>
     <w:p>
@@ -901,7 +956,7 @@
           <w:sz w:val="20"/>
           <w:szCs w:val="20"/>
         </w:rPr>
-        <w:t xml:space="preserve">Client Communications, </w:t>
+        <w:t>Client Communications</w:t>
       </w:r>
     </w:p>
     <w:p>
@@ -922,7 +977,7 @@
           <w:sz w:val="20"/>
           <w:szCs w:val="20"/>
         </w:rPr>
-        <w:t xml:space="preserve">Project Management, </w:t>
+        <w:t>Project Management</w:t>
       </w:r>
     </w:p>
     <w:p>
@@ -1157,49 +1212,7 @@
           <w:sz w:val="20"/>
           <w:szCs w:val="20"/>
         </w:rPr>
-        <w:t>May</w:t>
-      </w:r>
-      <w:r>
-        <w:rPr>
-          <w:sz w:val="20"/>
-          <w:szCs w:val="20"/>
-        </w:rPr>
-        <w:t xml:space="preserve"> 201</w:t>
-      </w:r>
-      <w:r>
-        <w:rPr>
-          <w:sz w:val="20"/>
-          <w:szCs w:val="20"/>
-        </w:rPr>
-        <w:t>1</w:t>
-      </w:r>
-      <w:r>
-        <w:rPr>
-          <w:sz w:val="20"/>
-          <w:szCs w:val="20"/>
-        </w:rPr>
-        <w:t xml:space="preserve"> –</w:t>
-      </w:r>
-      <w:r>
-        <w:rPr>
-          <w:sz w:val="20"/>
-          <w:szCs w:val="20"/>
-        </w:rPr>
-        <w:t xml:space="preserve"> July </w:t>
-      </w:r>
-      <w:r>
-        <w:rPr>
-          <w:sz w:val="20"/>
-          <w:szCs w:val="20"/>
-        </w:rPr>
-        <w:t>201</w:t>
-      </w:r>
-      <w:r>
-        <w:rPr>
-          <w:sz w:val="20"/>
-          <w:szCs w:val="20"/>
-        </w:rPr>
-        <w:t>3</w:t>
+        <w:t>May 2011 – July 2013</w:t>
       </w:r>
     </w:p>
     <w:p>
@@ -1325,49 +1338,7 @@
           <w:sz w:val="20"/>
           <w:szCs w:val="20"/>
         </w:rPr>
-        <w:t>May</w:t>
-      </w:r>
-      <w:r>
-        <w:rPr>
-          <w:sz w:val="20"/>
-          <w:szCs w:val="20"/>
-        </w:rPr>
-        <w:t xml:space="preserve"> </w:t>
-      </w:r>
-      <w:r>
-        <w:rPr>
-          <w:sz w:val="20"/>
-          <w:szCs w:val="20"/>
-        </w:rPr>
-        <w:t>2014</w:t>
-      </w:r>
-      <w:r>
-        <w:rPr>
-          <w:sz w:val="20"/>
-          <w:szCs w:val="20"/>
-        </w:rPr>
-        <w:t xml:space="preserve"> – </w:t>
-      </w:r>
-      <w:r>
-        <w:rPr>
-          <w:sz w:val="20"/>
-          <w:szCs w:val="20"/>
-        </w:rPr>
-        <w:t>May</w:t>
-      </w:r>
-      <w:r>
-        <w:rPr>
-          <w:sz w:val="20"/>
-          <w:szCs w:val="20"/>
-        </w:rPr>
-        <w:t xml:space="preserve"> 201</w:t>
-      </w:r>
-      <w:r>
-        <w:rPr>
-          <w:sz w:val="20"/>
-          <w:szCs w:val="20"/>
-        </w:rPr>
-        <w:t>5</w:t>
+        <w:t>May 2014 – May 2015</w:t>
       </w:r>
     </w:p>
     <w:p>
@@ -1462,17 +1433,7 @@
           <w:szCs w:val="28"/>
           <w:u w:val="single"/>
         </w:rPr>
-        <w:t>E</w:t>
-      </w:r>
-      <w:r>
-        <w:rPr>
-          <w:b/>
-          <w:bCs/>
-          <w:sz w:val="28"/>
-          <w:szCs w:val="28"/>
-          <w:u w:val="single"/>
-        </w:rPr>
-        <w:t>DUCATION</w:t>
+        <w:t>EDUCATION</w:t>
       </w:r>
       <w:r>
         <w:rPr>
@@ -1991,6 +1952,543 @@
           <w:szCs w:val="28"/>
         </w:rPr>
       </w:pPr>
+    </w:p>
+    <w:p>
+      <w:pPr>
+        <w:spacing w:after="0"/>
+        <w:rPr>
+          <w:b/>
+          <w:bCs/>
+          <w:u w:val="single"/>
+        </w:rPr>
+      </w:pPr>
+      <w:r>
+        <w:rPr>
+          <w:b/>
+          <w:bCs/>
+          <w:sz w:val="28"/>
+          <w:szCs w:val="28"/>
+          <w:u w:val="single"/>
+        </w:rPr>
+        <w:t>PROJECTS</w:t>
+      </w:r>
+      <w:r>
+        <w:rPr>
+          <w:b/>
+          <w:bCs/>
+          <w:sz w:val="28"/>
+          <w:szCs w:val="28"/>
+          <w:u w:val="single"/>
+        </w:rPr>
+        <w:tab/>
+      </w:r>
+      <w:r>
+        <w:rPr>
+          <w:b/>
+          <w:bCs/>
+          <w:sz w:val="28"/>
+          <w:szCs w:val="28"/>
+          <w:u w:val="single"/>
+        </w:rPr>
+        <w:tab/>
+      </w:r>
+      <w:r>
+        <w:rPr>
+          <w:b/>
+          <w:bCs/>
+          <w:u w:val="single"/>
+        </w:rPr>
+        <w:tab/>
+      </w:r>
+      <w:r>
+        <w:rPr>
+          <w:b/>
+          <w:bCs/>
+          <w:u w:val="single"/>
+        </w:rPr>
+        <w:tab/>
+      </w:r>
+      <w:r>
+        <w:rPr>
+          <w:b/>
+          <w:bCs/>
+          <w:u w:val="single"/>
+        </w:rPr>
+        <w:tab/>
+      </w:r>
+      <w:r>
+        <w:rPr>
+          <w:b/>
+          <w:bCs/>
+          <w:u w:val="single"/>
+        </w:rPr>
+        <w:tab/>
+      </w:r>
+      <w:r>
+        <w:rPr>
+          <w:b/>
+          <w:bCs/>
+          <w:u w:val="single"/>
+        </w:rPr>
+        <w:tab/>
+      </w:r>
+      <w:r>
+        <w:rPr>
+          <w:b/>
+          <w:bCs/>
+          <w:u w:val="single"/>
+        </w:rPr>
+        <w:tab/>
+      </w:r>
+      <w:r>
+        <w:rPr>
+          <w:b/>
+          <w:bCs/>
+          <w:u w:val="single"/>
+        </w:rPr>
+        <w:tab/>
+      </w:r>
+      <w:r>
+        <w:rPr>
+          <w:b/>
+          <w:bCs/>
+          <w:u w:val="single"/>
+        </w:rPr>
+        <w:tab/>
+      </w:r>
+      <w:r>
+        <w:rPr>
+          <w:b/>
+          <w:bCs/>
+          <w:u w:val="single"/>
+        </w:rPr>
+        <w:tab/>
+      </w:r>
+      <w:r>
+        <w:rPr>
+          <w:b/>
+          <w:bCs/>
+          <w:u w:val="single"/>
+        </w:rPr>
+        <w:tab/>
+      </w:r>
+      <w:r>
+        <w:rPr>
+          <w:b/>
+          <w:bCs/>
+          <w:u w:val="single"/>
+        </w:rPr>
+        <w:tab/>
+      </w:r>
+    </w:p>
+    <w:p>
+      <w:pPr>
+        <w:pStyle w:val="ListParagraph"/>
+        <w:numPr>
+          <w:ilvl w:val="0"/>
+          <w:numId w:val="2"/>
+        </w:numPr>
+        <w:spacing w:after="0"/>
+        <w:rPr>
+          <w:sz w:val="20"/>
+          <w:szCs w:val="20"/>
+        </w:rPr>
+      </w:pPr>
+      <w:r>
+        <w:rPr>
+          <w:sz w:val="20"/>
+          <w:szCs w:val="20"/>
+        </w:rPr>
+        <w:t>ClientPoint</w:t>
+      </w:r>
+    </w:p>
+    <w:p>
+      <w:pPr>
+        <w:pStyle w:val="ListParagraph"/>
+        <w:numPr>
+          <w:ilvl w:val="0"/>
+          <w:numId w:val="2"/>
+        </w:numPr>
+        <w:spacing w:after="0"/>
+        <w:rPr>
+          <w:sz w:val="20"/>
+          <w:szCs w:val="20"/>
+        </w:rPr>
+      </w:pPr>
+      <w:r>
+        <w:rPr>
+          <w:sz w:val="20"/>
+          <w:szCs w:val="20"/>
+        </w:rPr>
+        <w:t>B</w:t>
+      </w:r>
+      <w:r>
+        <w:rPr>
+          <w:sz w:val="20"/>
+          <w:szCs w:val="20"/>
+        </w:rPr>
+        <w:t>rilliant</w:t>
+      </w:r>
+      <w:r>
+        <w:rPr>
+          <w:sz w:val="20"/>
+          <w:szCs w:val="20"/>
+        </w:rPr>
+        <w:t xml:space="preserve"> A</w:t>
+      </w:r>
+      <w:r>
+        <w:rPr>
+          <w:sz w:val="20"/>
+          <w:szCs w:val="20"/>
+        </w:rPr>
+        <w:t>venir</w:t>
+      </w:r>
+    </w:p>
+    <w:p>
+      <w:pPr>
+        <w:pStyle w:val="ListParagraph"/>
+        <w:numPr>
+          <w:ilvl w:val="0"/>
+          <w:numId w:val="2"/>
+        </w:numPr>
+        <w:spacing w:after="0" w:line="240" w:lineRule="auto"/>
+        <w:rPr>
+          <w:sz w:val="20"/>
+          <w:szCs w:val="20"/>
+        </w:rPr>
+      </w:pPr>
+      <w:r>
+        <w:rPr>
+          <w:sz w:val="20"/>
+          <w:szCs w:val="20"/>
+        </w:rPr>
+        <w:t>Orange Dental Clinics</w:t>
+      </w:r>
+    </w:p>
+    <w:p>
+      <w:pPr>
+        <w:pStyle w:val="ListParagraph"/>
+        <w:numPr>
+          <w:ilvl w:val="0"/>
+          <w:numId w:val="2"/>
+        </w:numPr>
+        <w:spacing w:after="0" w:line="240" w:lineRule="auto"/>
+        <w:rPr>
+          <w:sz w:val="20"/>
+          <w:szCs w:val="20"/>
+        </w:rPr>
+      </w:pPr>
+      <w:r>
+        <w:rPr>
+          <w:sz w:val="20"/>
+          <w:szCs w:val="20"/>
+        </w:rPr>
+        <w:t>Sparkle Lites</w:t>
+      </w:r>
+    </w:p>
+    <w:p>
+      <w:pPr>
+        <w:pStyle w:val="ListParagraph"/>
+        <w:numPr>
+          <w:ilvl w:val="0"/>
+          <w:numId w:val="2"/>
+        </w:numPr>
+        <w:spacing w:after="0" w:line="240" w:lineRule="auto"/>
+        <w:rPr>
+          <w:sz w:val="20"/>
+          <w:szCs w:val="20"/>
+        </w:rPr>
+      </w:pPr>
+      <w:r>
+        <w:rPr>
+          <w:sz w:val="20"/>
+          <w:szCs w:val="20"/>
+        </w:rPr>
+        <w:t>Party Dots</w:t>
+      </w:r>
+    </w:p>
+    <w:p>
+      <w:pPr>
+        <w:pStyle w:val="ListParagraph"/>
+        <w:numPr>
+          <w:ilvl w:val="0"/>
+          <w:numId w:val="2"/>
+        </w:numPr>
+        <w:spacing w:after="0" w:line="240" w:lineRule="auto"/>
+        <w:rPr>
+          <w:sz w:val="20"/>
+          <w:szCs w:val="20"/>
+        </w:rPr>
+      </w:pPr>
+      <w:r>
+        <w:rPr>
+          <w:sz w:val="20"/>
+          <w:szCs w:val="20"/>
+        </w:rPr>
+        <w:t>Mover Toys</w:t>
+      </w:r>
+    </w:p>
+    <w:p>
+      <w:pPr>
+        <w:pStyle w:val="ListParagraph"/>
+        <w:numPr>
+          <w:ilvl w:val="0"/>
+          <w:numId w:val="2"/>
+        </w:numPr>
+        <w:spacing w:after="0" w:line="240" w:lineRule="auto"/>
+        <w:rPr>
+          <w:sz w:val="20"/>
+          <w:szCs w:val="20"/>
+        </w:rPr>
+      </w:pPr>
+      <w:r>
+        <w:rPr>
+          <w:sz w:val="20"/>
+          <w:szCs w:val="20"/>
+        </w:rPr>
+        <w:t>Live Betting</w:t>
+      </w:r>
+    </w:p>
+    <w:p>
+      <w:pPr>
+        <w:pStyle w:val="ListParagraph"/>
+        <w:numPr>
+          <w:ilvl w:val="0"/>
+          <w:numId w:val="2"/>
+        </w:numPr>
+        <w:spacing w:after="0" w:line="240" w:lineRule="auto"/>
+        <w:rPr>
+          <w:sz w:val="20"/>
+          <w:szCs w:val="20"/>
+        </w:rPr>
+      </w:pPr>
+      <w:proofErr w:type="spellStart"/>
+      <w:r>
+        <w:rPr>
+          <w:sz w:val="20"/>
+          <w:szCs w:val="20"/>
+        </w:rPr>
+        <w:t>Incodis</w:t>
+      </w:r>
+      <w:proofErr w:type="spellEnd"/>
+    </w:p>
+    <w:p>
+      <w:pPr>
+        <w:pStyle w:val="ListParagraph"/>
+        <w:numPr>
+          <w:ilvl w:val="0"/>
+          <w:numId w:val="2"/>
+        </w:numPr>
+        <w:spacing w:after="0" w:line="240" w:lineRule="auto"/>
+        <w:rPr>
+          <w:sz w:val="20"/>
+          <w:szCs w:val="20"/>
+        </w:rPr>
+      </w:pPr>
+      <w:r>
+        <w:rPr>
+          <w:sz w:val="20"/>
+          <w:szCs w:val="20"/>
+        </w:rPr>
+        <w:t>Mobile Deals</w:t>
+      </w:r>
+    </w:p>
+    <w:p>
+      <w:pPr>
+        <w:pStyle w:val="ListParagraph"/>
+        <w:numPr>
+          <w:ilvl w:val="0"/>
+          <w:numId w:val="2"/>
+        </w:numPr>
+        <w:spacing w:after="0" w:line="240" w:lineRule="auto"/>
+        <w:rPr>
+          <w:sz w:val="20"/>
+          <w:szCs w:val="20"/>
+        </w:rPr>
+      </w:pPr>
+      <w:r>
+        <w:rPr>
+          <w:sz w:val="20"/>
+          <w:szCs w:val="20"/>
+        </w:rPr>
+        <w:t>901 Sounds</w:t>
+      </w:r>
+    </w:p>
+    <w:p>
+      <w:pPr>
+        <w:pStyle w:val="ListParagraph"/>
+        <w:numPr>
+          <w:ilvl w:val="0"/>
+          <w:numId w:val="2"/>
+        </w:numPr>
+        <w:spacing w:after="0" w:line="240" w:lineRule="auto"/>
+        <w:rPr>
+          <w:sz w:val="20"/>
+          <w:szCs w:val="20"/>
+        </w:rPr>
+      </w:pPr>
+      <w:r>
+        <w:rPr>
+          <w:sz w:val="20"/>
+          <w:szCs w:val="20"/>
+        </w:rPr>
+        <w:t>Raging Room</w:t>
+      </w:r>
+    </w:p>
+    <w:p>
+      <w:pPr>
+        <w:spacing w:after="0" w:line="240" w:lineRule="auto"/>
+        <w:rPr>
+          <w:sz w:val="20"/>
+          <w:szCs w:val="20"/>
+        </w:rPr>
+      </w:pPr>
+    </w:p>
+    <w:p>
+      <w:pPr>
+        <w:spacing w:after="0" w:line="240" w:lineRule="auto"/>
+        <w:rPr>
+          <w:sz w:val="20"/>
+          <w:szCs w:val="20"/>
+        </w:rPr>
+      </w:pPr>
+    </w:p>
+    <w:p>
+      <w:pPr>
+        <w:spacing w:after="0" w:line="240" w:lineRule="auto"/>
+        <w:rPr>
+          <w:sz w:val="20"/>
+          <w:szCs w:val="20"/>
+        </w:rPr>
+      </w:pPr>
+    </w:p>
+    <w:p>
+      <w:pPr>
+        <w:spacing w:after="0" w:line="240" w:lineRule="auto"/>
+        <w:rPr>
+          <w:sz w:val="20"/>
+          <w:szCs w:val="20"/>
+        </w:rPr>
+      </w:pPr>
+      <w:proofErr w:type="gramStart"/>
+      <w:r>
+        <w:rPr>
+          <w:sz w:val="20"/>
+          <w:szCs w:val="20"/>
+        </w:rPr>
+        <w:t>Date :</w:t>
+      </w:r>
+      <w:proofErr w:type="gramEnd"/>
+    </w:p>
+    <w:p>
+      <w:pPr>
+        <w:spacing w:after="0" w:line="240" w:lineRule="auto"/>
+        <w:rPr>
+          <w:sz w:val="20"/>
+          <w:szCs w:val="20"/>
+        </w:rPr>
+      </w:pPr>
+    </w:p>
+    <w:p>
+      <w:pPr>
+        <w:spacing w:after="0" w:line="240" w:lineRule="auto"/>
+        <w:rPr>
+          <w:sz w:val="20"/>
+          <w:szCs w:val="20"/>
+        </w:rPr>
+      </w:pPr>
+      <w:r>
+        <w:rPr>
+          <w:sz w:val="20"/>
+          <w:szCs w:val="20"/>
+        </w:rPr>
+        <w:t>Place:</w:t>
+      </w:r>
+      <w:r>
+        <w:rPr>
+          <w:sz w:val="20"/>
+          <w:szCs w:val="20"/>
+        </w:rPr>
+        <w:tab/>
+      </w:r>
+      <w:r>
+        <w:rPr>
+          <w:sz w:val="20"/>
+          <w:szCs w:val="20"/>
+        </w:rPr>
+        <w:tab/>
+      </w:r>
+      <w:r>
+        <w:rPr>
+          <w:sz w:val="20"/>
+          <w:szCs w:val="20"/>
+        </w:rPr>
+        <w:tab/>
+      </w:r>
+      <w:r>
+        <w:rPr>
+          <w:sz w:val="20"/>
+          <w:szCs w:val="20"/>
+        </w:rPr>
+        <w:tab/>
+      </w:r>
+      <w:r>
+        <w:rPr>
+          <w:sz w:val="20"/>
+          <w:szCs w:val="20"/>
+        </w:rPr>
+        <w:tab/>
+      </w:r>
+      <w:r>
+        <w:rPr>
+          <w:sz w:val="20"/>
+          <w:szCs w:val="20"/>
+        </w:rPr>
+        <w:tab/>
+      </w:r>
+      <w:r>
+        <w:rPr>
+          <w:sz w:val="20"/>
+          <w:szCs w:val="20"/>
+        </w:rPr>
+        <w:tab/>
+      </w:r>
+      <w:r>
+        <w:rPr>
+          <w:sz w:val="20"/>
+          <w:szCs w:val="20"/>
+        </w:rPr>
+        <w:tab/>
+      </w:r>
+      <w:r>
+        <w:rPr>
+          <w:sz w:val="20"/>
+          <w:szCs w:val="20"/>
+        </w:rPr>
+        <w:tab/>
+      </w:r>
+      <w:r>
+        <w:rPr>
+          <w:sz w:val="20"/>
+          <w:szCs w:val="20"/>
+        </w:rPr>
+        <w:tab/>
+      </w:r>
+      <w:r>
+        <w:rPr>
+          <w:sz w:val="20"/>
+          <w:szCs w:val="20"/>
+        </w:rPr>
+        <w:tab/>
+      </w:r>
+      <w:r>
+        <w:rPr>
+          <w:sz w:val="20"/>
+          <w:szCs w:val="20"/>
+        </w:rPr>
+        <w:tab/>
+        <w:t>(Signature)</w:t>
+      </w:r>
     </w:p>
     <w:sectPr>
       <w:pgSz w:w="12240" w:h="15840"/>
@@ -2005,6 +2503,119 @@
 <file path=word/numbering.xml><?xml version="1.0" encoding="utf-8"?>
 <w:numbering xmlns:wpc="http://schemas.microsoft.com/office/word/2010/wordprocessingCanvas" xmlns:cx="http://schemas.microsoft.com/office/drawing/2014/chartex" xmlns:cx1="http://schemas.microsoft.com/office/drawing/2015/9/8/chartex" xmlns:cx2="http://schemas.microsoft.com/office/drawing/2015/10/21/chartex" xmlns:cx3="http://schemas.microsoft.com/office/drawing/2016/5/9/chartex" xmlns:cx4="http://schemas.microsoft.com/office/drawing/2016/5/10/chartex" xmlns:cx5="http://schemas.microsoft.com/office/drawing/2016/5/11/chartex" xmlns:cx6="http://schemas.microsoft.com/office/drawing/2016/5/12/chartex" xmlns:cx7="http://schemas.microsoft.com/office/drawing/2016/5/13/chartex" xmlns:cx8="http://schemas.microsoft.com/office/drawing/2016/5/14/chartex" xmlns:mc="http://schemas.openxmlformats.org/markup-compatibility/2006" xmlns:aink="http://schemas.microsoft.com/office/drawing/2016/ink" xmlns:am3d="http://schemas.microsoft.com/office/drawing/2017/model3d" xmlns:o="urn:schemas-microsoft-com:office:office" xmlns:oel="http://schemas.microsoft.com/office/2019/extlst" xmlns:r="http://schemas.openxmlformats.org/officeDocument/2006/relationships" xmlns:m="http://schemas.openxmlformats.org/officeDocument/2006/math" xmlns:v="urn:schemas-microsoft-com:vml" xmlns:wp14="http://schemas.microsoft.com/office/word/2010/wordprocessingDrawing" xmlns:wp="http://schemas.openxmlformats.org/drawingml/2006/wordprocessingDrawing" xmlns:w10="urn:schemas-microsoft-com:office:word" xmlns:w="http://schemas.openxmlformats.org/wordprocessingml/2006/main" xmlns:w14="http://schemas.microsoft.com/office/word/2010/wordml" xmlns:w15="http://schemas.microsoft.com/office/word/2012/wordml" xmlns:w16cex="http://schemas.microsoft.com/office/word/2018/wordml/cex" xmlns:w16cid="http://schemas.microsoft.com/office/word/2016/wordml/cid" xmlns:w16="http://schemas.microsoft.com/office/word/2018/wordml" xmlns:w16du="http://schemas.microsoft.com/office/word/2023/wordml/word16du" xmlns:w16sdtdh="http://schemas.microsoft.com/office/word/2020/wordml/sdtdatahash" xmlns:w16sdtfl="http://schemas.microsoft.com/office/word/2024/wordml/sdtformatlock" xmlns:w16se="http://schemas.microsoft.com/office/word/2015/wordml/symex" xmlns:wpg="http://schemas.microsoft.com/office/word/2010/wordprocessingGroup" xmlns:wpi="http://schemas.microsoft.com/office/word/2010/wordprocessingInk" xmlns:wne="http://schemas.microsoft.com/office/word/2006/wordml" xmlns:wps="http://schemas.microsoft.com/office/word/2010/wordprocessingShape" mc:Ignorable="w14 w15 w16se w16cid w16 w16cex w16sdtdh w16sdtfl w16du wp14">
   <w:abstractNum w:abstractNumId="0" w15:restartNumberingAfterBreak="0">
+    <w:nsid w:val="21A604AD"/>
+    <w:multiLevelType w:val="hybridMultilevel"/>
+    <w:tmpl w:val="A6BA9C4E"/>
+    <w:lvl w:ilvl="0" w:tplc="04090001">
+      <w:start w:val="1"/>
+      <w:numFmt w:val="bullet"/>
+      <w:lvlText w:val=""/>
+      <w:lvlJc w:val="left"/>
+      <w:pPr>
+        <w:ind w:left="720" w:hanging="360"/>
+      </w:pPr>
+      <w:rPr>
+        <w:rFonts w:ascii="Symbol" w:hAnsi="Symbol" w:hint="default"/>
+      </w:rPr>
+    </w:lvl>
+    <w:lvl w:ilvl="1" w:tplc="04090003" w:tentative="1">
+      <w:start w:val="1"/>
+      <w:numFmt w:val="bullet"/>
+      <w:lvlText w:val="o"/>
+      <w:lvlJc w:val="left"/>
+      <w:pPr>
+        <w:ind w:left="1440" w:hanging="360"/>
+      </w:pPr>
+      <w:rPr>
+        <w:rFonts w:ascii="Courier New" w:hAnsi="Courier New" w:cs="Courier New" w:hint="default"/>
+      </w:rPr>
+    </w:lvl>
+    <w:lvl w:ilvl="2" w:tplc="04090005" w:tentative="1">
+      <w:start w:val="1"/>
+      <w:numFmt w:val="bullet"/>
+      <w:lvlText w:val=""/>
+      <w:lvlJc w:val="left"/>
+      <w:pPr>
+        <w:ind w:left="2160" w:hanging="360"/>
+      </w:pPr>
+      <w:rPr>
+        <w:rFonts w:ascii="Wingdings" w:hAnsi="Wingdings" w:hint="default"/>
+      </w:rPr>
+    </w:lvl>
+    <w:lvl w:ilvl="3" w:tplc="04090001" w:tentative="1">
+      <w:start w:val="1"/>
+      <w:numFmt w:val="bullet"/>
+      <w:lvlText w:val=""/>
+      <w:lvlJc w:val="left"/>
+      <w:pPr>
+        <w:ind w:left="2880" w:hanging="360"/>
+      </w:pPr>
+      <w:rPr>
+        <w:rFonts w:ascii="Symbol" w:hAnsi="Symbol" w:hint="default"/>
+      </w:rPr>
+    </w:lvl>
+    <w:lvl w:ilvl="4" w:tplc="04090003" w:tentative="1">
+      <w:start w:val="1"/>
+      <w:numFmt w:val="bullet"/>
+      <w:lvlText w:val="o"/>
+      <w:lvlJc w:val="left"/>
+      <w:pPr>
+        <w:ind w:left="3600" w:hanging="360"/>
+      </w:pPr>
+      <w:rPr>
+        <w:rFonts w:ascii="Courier New" w:hAnsi="Courier New" w:cs="Courier New" w:hint="default"/>
+      </w:rPr>
+    </w:lvl>
+    <w:lvl w:ilvl="5" w:tplc="04090005" w:tentative="1">
+      <w:start w:val="1"/>
+      <w:numFmt w:val="bullet"/>
+      <w:lvlText w:val=""/>
+      <w:lvlJc w:val="left"/>
+      <w:pPr>
+        <w:ind w:left="4320" w:hanging="360"/>
+      </w:pPr>
+      <w:rPr>
+        <w:rFonts w:ascii="Wingdings" w:hAnsi="Wingdings" w:hint="default"/>
+      </w:rPr>
+    </w:lvl>
+    <w:lvl w:ilvl="6" w:tplc="04090001" w:tentative="1">
+      <w:start w:val="1"/>
+      <w:numFmt w:val="bullet"/>
+      <w:lvlText w:val=""/>
+      <w:lvlJc w:val="left"/>
+      <w:pPr>
+        <w:ind w:left="5040" w:hanging="360"/>
+      </w:pPr>
+      <w:rPr>
+        <w:rFonts w:ascii="Symbol" w:hAnsi="Symbol" w:hint="default"/>
+      </w:rPr>
+    </w:lvl>
+    <w:lvl w:ilvl="7" w:tplc="04090003" w:tentative="1">
+      <w:start w:val="1"/>
+      <w:numFmt w:val="bullet"/>
+      <w:lvlText w:val="o"/>
+      <w:lvlJc w:val="left"/>
+      <w:pPr>
+        <w:ind w:left="5760" w:hanging="360"/>
+      </w:pPr>
+      <w:rPr>
+        <w:rFonts w:ascii="Courier New" w:hAnsi="Courier New" w:cs="Courier New" w:hint="default"/>
+      </w:rPr>
+    </w:lvl>
+    <w:lvl w:ilvl="8" w:tplc="04090005" w:tentative="1">
+      <w:start w:val="1"/>
+      <w:numFmt w:val="bullet"/>
+      <w:lvlText w:val=""/>
+      <w:lvlJc w:val="left"/>
+      <w:pPr>
+        <w:ind w:left="6480" w:hanging="360"/>
+      </w:pPr>
+      <w:rPr>
+        <w:rFonts w:ascii="Wingdings" w:hAnsi="Wingdings" w:hint="default"/>
+      </w:rPr>
+    </w:lvl>
+  </w:abstractNum>
+  <w:abstractNum w:abstractNumId="1" w15:restartNumberingAfterBreak="0">
     <w:nsid w:val="24CC55EA"/>
     <w:multiLevelType w:val="hybridMultilevel"/>
     <w:tmpl w:val="75BC2D54"/>
@@ -2118,6 +2729,9 @@
     </w:lvl>
   </w:abstractNum>
   <w:num w:numId="1" w16cid:durableId="913516857">
+    <w:abstractNumId w:val="1"/>
+  </w:num>
+  <w:num w:numId="2" w16cid:durableId="1134831028">
     <w:abstractNumId w:val="0"/>
   </w:num>
 </w:numbering>

</xml_diff>

<commit_message>
Add Updated Resume for Interview
</commit_message>
<xml_diff>
--- a/Resume.docx
+++ b/Resume.docx
@@ -149,7 +149,21 @@
                 <w:sz w:val="20"/>
                 <w:szCs w:val="20"/>
               </w:rPr>
-              <w:t xml:space="preserve"> +91 9041-381050</w:t>
+              <w:t xml:space="preserve"> +91</w:t>
+            </w:r>
+            <w:r>
+              <w:rPr>
+                <w:sz w:val="20"/>
+                <w:szCs w:val="20"/>
+              </w:rPr>
+              <w:t>-</w:t>
+            </w:r>
+            <w:r>
+              <w:rPr>
+                <w:sz w:val="20"/>
+                <w:szCs w:val="20"/>
+              </w:rPr>
+              <w:t>9041-381050</w:t>
             </w:r>
           </w:p>
         </w:tc>
@@ -164,31 +178,6 @@
                 <w:szCs w:val="20"/>
               </w:rPr>
             </w:pPr>
-            <w:proofErr w:type="gramStart"/>
-            <w:r>
-              <w:rPr>
-                <w:b/>
-                <w:bCs/>
-                <w:sz w:val="20"/>
-                <w:szCs w:val="20"/>
-              </w:rPr>
-              <w:t>LinkedIn:-</w:t>
-            </w:r>
-            <w:proofErr w:type="gramEnd"/>
-            <w:r>
-              <w:rPr>
-                <w:sz w:val="20"/>
-                <w:szCs w:val="20"/>
-              </w:rPr>
-              <w:t xml:space="preserve"> </w:t>
-            </w:r>
-            <w:r>
-              <w:rPr>
-                <w:sz w:val="20"/>
-                <w:szCs w:val="20"/>
-              </w:rPr>
-              <w:t>linkedin.com/in/tarun-kumar-5a113328/</w:t>
-            </w:r>
           </w:p>
         </w:tc>
       </w:tr>
@@ -419,69 +408,32 @@
     </w:p>
     <w:p>
       <w:pPr>
-        <w:spacing w:after="0" w:line="240" w:lineRule="auto"/>
-        <w:rPr>
-          <w:sz w:val="20"/>
-          <w:szCs w:val="20"/>
-        </w:rPr>
-      </w:pPr>
-      <w:r>
-        <w:rPr>
-          <w:sz w:val="20"/>
-          <w:szCs w:val="20"/>
-        </w:rPr>
-        <w:t>Enthusiastic PHP Developer from last 1</w:t>
-      </w:r>
-      <w:r>
-        <w:rPr>
-          <w:sz w:val="20"/>
-          <w:szCs w:val="20"/>
-        </w:rPr>
-        <w:t>4</w:t>
-      </w:r>
-      <w:r>
-        <w:rPr>
-          <w:sz w:val="20"/>
-          <w:szCs w:val="20"/>
-        </w:rPr>
-        <w:t>+</w:t>
-      </w:r>
-      <w:r>
-        <w:rPr>
-          <w:sz w:val="20"/>
-          <w:szCs w:val="20"/>
-        </w:rPr>
-        <w:t xml:space="preserve"> years of Experience in PHP, </w:t>
-      </w:r>
-      <w:proofErr w:type="spellStart"/>
-      <w:r>
-        <w:rPr>
-          <w:sz w:val="20"/>
-          <w:szCs w:val="20"/>
-        </w:rPr>
-        <w:t>MySql</w:t>
-      </w:r>
-      <w:proofErr w:type="spellEnd"/>
-      <w:r>
-        <w:rPr>
-          <w:sz w:val="20"/>
-          <w:szCs w:val="20"/>
-        </w:rPr>
-        <w:t>, CSS and HTML</w:t>
-      </w:r>
-      <w:r>
-        <w:rPr>
-          <w:sz w:val="20"/>
-          <w:szCs w:val="20"/>
-        </w:rPr>
-        <w:t xml:space="preserve">. </w:t>
-      </w:r>
-      <w:r>
-        <w:rPr>
-          <w:sz w:val="20"/>
-          <w:szCs w:val="20"/>
-        </w:rPr>
-        <w:t>Seeking the opportunity to increase the client base as PHP Developer at Super Software.</w:t>
+        <w:spacing w:after="0"/>
+        <w:rPr>
+          <w:sz w:val="20"/>
+          <w:szCs w:val="20"/>
+        </w:rPr>
+      </w:pPr>
+      <w:r>
+        <w:rPr>
+          <w:sz w:val="20"/>
+          <w:szCs w:val="20"/>
+        </w:rPr>
+        <w:t xml:space="preserve">To achieve an honorable position in a renowned organization, providing challenging growth opportunities according to my worth and wherein I could make a meaningful contribution to the growth of the organization in the domain of </w:t>
+      </w:r>
+      <w:r>
+        <w:rPr>
+          <w:sz w:val="20"/>
+          <w:szCs w:val="20"/>
+        </w:rPr>
+        <w:t>Software Development</w:t>
+      </w:r>
+      <w:r>
+        <w:rPr>
+          <w:sz w:val="20"/>
+          <w:szCs w:val="20"/>
+        </w:rPr>
+        <w:t>.</w:t>
       </w:r>
     </w:p>
     <w:p>
@@ -614,12 +566,19 @@
     </w:p>
     <w:p>
       <w:pPr>
-        <w:spacing w:after="0" w:line="480" w:lineRule="auto"/>
-        <w:rPr>
-          <w:sz w:val="20"/>
-          <w:szCs w:val="20"/>
-        </w:rPr>
-      </w:pPr>
+        <w:spacing w:after="0" w:line="240" w:lineRule="auto"/>
+        <w:rPr>
+          <w:sz w:val="20"/>
+          <w:szCs w:val="20"/>
+        </w:rPr>
+      </w:pPr>
+      <w:r>
+        <w:rPr>
+          <w:sz w:val="20"/>
+          <w:szCs w:val="20"/>
+        </w:rPr>
+        <w:t xml:space="preserve">Laravel, ReactJS, </w:t>
+      </w:r>
       <w:r>
         <w:rPr>
           <w:sz w:val="20"/>
@@ -639,30 +598,43 @@
           <w:sz w:val="20"/>
           <w:szCs w:val="20"/>
         </w:rPr>
-        <w:t xml:space="preserve"> Web APIs,</w:t>
-      </w:r>
-      <w:r>
-        <w:rPr>
-          <w:sz w:val="20"/>
-          <w:szCs w:val="20"/>
-        </w:rPr>
-        <w:t xml:space="preserve"> OOPS, </w:t>
-      </w:r>
-      <w:proofErr w:type="gramStart"/>
-      <w:r>
-        <w:rPr>
-          <w:sz w:val="20"/>
-          <w:szCs w:val="20"/>
-        </w:rPr>
-        <w:t xml:space="preserve">MySQL, </w:t>
-      </w:r>
-      <w:r>
-        <w:rPr>
-          <w:sz w:val="20"/>
-          <w:szCs w:val="20"/>
-        </w:rPr>
         <w:t xml:space="preserve"> </w:t>
       </w:r>
+      <w:r>
+        <w:rPr>
+          <w:sz w:val="20"/>
+          <w:szCs w:val="20"/>
+        </w:rPr>
+        <w:t xml:space="preserve">WordPress, </w:t>
+      </w:r>
+      <w:r>
+        <w:rPr>
+          <w:sz w:val="20"/>
+          <w:szCs w:val="20"/>
+        </w:rPr>
+        <w:t>Web APIs,</w:t>
+      </w:r>
+      <w:r>
+        <w:rPr>
+          <w:sz w:val="20"/>
+          <w:szCs w:val="20"/>
+        </w:rPr>
+        <w:t xml:space="preserve"> OOPS, MySQL,</w:t>
+      </w:r>
+      <w:r>
+        <w:rPr>
+          <w:sz w:val="20"/>
+          <w:szCs w:val="20"/>
+        </w:rPr>
+        <w:t xml:space="preserve"> </w:t>
+      </w:r>
+      <w:r>
+        <w:rPr>
+          <w:sz w:val="20"/>
+          <w:szCs w:val="20"/>
+        </w:rPr>
+        <w:t xml:space="preserve">Postman, </w:t>
+      </w:r>
       <w:proofErr w:type="spellStart"/>
       <w:r>
         <w:rPr>
@@ -672,7 +644,6 @@
         <w:t>Javascript</w:t>
       </w:r>
       <w:proofErr w:type="spellEnd"/>
-      <w:proofErr w:type="gramEnd"/>
       <w:r>
         <w:rPr>
           <w:sz w:val="20"/>
@@ -1042,23 +1013,7 @@
           <w:szCs w:val="28"/>
           <w:u w:val="single"/>
         </w:rPr>
-        <w:t>EXPERIENCES</w:t>
-      </w:r>
-      <w:r>
-        <w:rPr>
-          <w:b/>
-          <w:bCs/>
-          <w:u w:val="single"/>
-        </w:rPr>
-        <w:tab/>
-      </w:r>
-      <w:r>
-        <w:rPr>
-          <w:b/>
-          <w:bCs/>
-          <w:u w:val="single"/>
-        </w:rPr>
-        <w:tab/>
+        <w:t>Employment Summary</w:t>
       </w:r>
       <w:r>
         <w:rPr>
@@ -1422,6 +1377,78 @@
         <w:rPr>
           <w:b/>
           <w:bCs/>
+          <w:sz w:val="28"/>
+          <w:szCs w:val="28"/>
+          <w:u w:val="single"/>
+        </w:rPr>
+      </w:pPr>
+    </w:p>
+    <w:p>
+      <w:pPr>
+        <w:spacing w:after="0"/>
+        <w:rPr>
+          <w:b/>
+          <w:bCs/>
+          <w:sz w:val="28"/>
+          <w:szCs w:val="28"/>
+          <w:u w:val="single"/>
+        </w:rPr>
+      </w:pPr>
+    </w:p>
+    <w:p>
+      <w:pPr>
+        <w:spacing w:after="0"/>
+        <w:rPr>
+          <w:b/>
+          <w:bCs/>
+          <w:sz w:val="28"/>
+          <w:szCs w:val="28"/>
+          <w:u w:val="single"/>
+        </w:rPr>
+      </w:pPr>
+    </w:p>
+    <w:p>
+      <w:pPr>
+        <w:spacing w:after="0"/>
+        <w:rPr>
+          <w:b/>
+          <w:bCs/>
+          <w:sz w:val="28"/>
+          <w:szCs w:val="28"/>
+          <w:u w:val="single"/>
+        </w:rPr>
+      </w:pPr>
+    </w:p>
+    <w:p>
+      <w:pPr>
+        <w:spacing w:after="0"/>
+        <w:rPr>
+          <w:b/>
+          <w:bCs/>
+          <w:sz w:val="28"/>
+          <w:szCs w:val="28"/>
+          <w:u w:val="single"/>
+        </w:rPr>
+      </w:pPr>
+    </w:p>
+    <w:p>
+      <w:pPr>
+        <w:spacing w:after="0"/>
+        <w:rPr>
+          <w:b/>
+          <w:bCs/>
+          <w:sz w:val="28"/>
+          <w:szCs w:val="28"/>
+          <w:u w:val="single"/>
+        </w:rPr>
+      </w:pPr>
+    </w:p>
+    <w:p>
+      <w:pPr>
+        <w:spacing w:after="0"/>
+        <w:rPr>
+          <w:b/>
+          <w:bCs/>
           <w:u w:val="single"/>
         </w:rPr>
       </w:pPr>
@@ -1625,6 +1652,13 @@
           <w:bCs/>
         </w:rPr>
       </w:pPr>
+      <w:r>
+        <w:rPr>
+          <w:b/>
+          <w:bCs/>
+        </w:rPr>
+        <w:t>Post Graduate Dip. In Computer Applications</w:t>
+      </w:r>
     </w:p>
     <w:p>
       <w:pPr>
@@ -1633,10 +1667,17 @@
         </w:pBdr>
         <w:spacing w:after="0" w:line="240" w:lineRule="auto"/>
         <w:rPr>
-          <w:b/>
-          <w:bCs/>
-        </w:rPr>
-      </w:pPr>
+          <w:sz w:val="22"/>
+          <w:szCs w:val="22"/>
+        </w:rPr>
+      </w:pPr>
+      <w:r>
+        <w:rPr>
+          <w:sz w:val="22"/>
+          <w:szCs w:val="22"/>
+        </w:rPr>
+        <w:t>Kurukshetra University</w:t>
+      </w:r>
     </w:p>
     <w:p>
       <w:pPr>
@@ -1645,10 +1686,69 @@
         </w:pBdr>
         <w:spacing w:after="0" w:line="240" w:lineRule="auto"/>
         <w:rPr>
-          <w:b/>
-          <w:bCs/>
-        </w:rPr>
-      </w:pPr>
+          <w:sz w:val="22"/>
+          <w:szCs w:val="22"/>
+        </w:rPr>
+      </w:pPr>
+      <w:proofErr w:type="gramStart"/>
+      <w:r>
+        <w:rPr>
+          <w:sz w:val="22"/>
+          <w:szCs w:val="22"/>
+        </w:rPr>
+        <w:t>Year :</w:t>
+      </w:r>
+      <w:proofErr w:type="gramEnd"/>
+      <w:r>
+        <w:rPr>
+          <w:sz w:val="22"/>
+          <w:szCs w:val="22"/>
+        </w:rPr>
+        <w:t xml:space="preserve"> </w:t>
+      </w:r>
+      <w:r>
+        <w:rPr>
+          <w:sz w:val="22"/>
+          <w:szCs w:val="22"/>
+        </w:rPr>
+        <w:t>200</w:t>
+      </w:r>
+      <w:r>
+        <w:rPr>
+          <w:sz w:val="22"/>
+          <w:szCs w:val="22"/>
+        </w:rPr>
+        <w:t>6</w:t>
+      </w:r>
+    </w:p>
+    <w:p>
+      <w:pPr>
+        <w:spacing w:after="0" w:line="240" w:lineRule="auto"/>
+        <w:rPr>
+          <w:sz w:val="22"/>
+          <w:szCs w:val="22"/>
+        </w:rPr>
+      </w:pPr>
+    </w:p>
+    <w:p>
+      <w:pPr>
+        <w:spacing w:after="0" w:line="240" w:lineRule="auto"/>
+        <w:rPr>
+          <w:b/>
+          <w:bCs/>
+          <w:sz w:val="26"/>
+          <w:szCs w:val="26"/>
+        </w:rPr>
+      </w:pPr>
+      <w:r>
+        <w:rPr>
+          <w:b/>
+          <w:bCs/>
+          <w:sz w:val="26"/>
+          <w:szCs w:val="26"/>
+        </w:rPr>
+        <w:t>M.Sc. in Computer Science</w:t>
+      </w:r>
     </w:p>
     <w:p>
       <w:pPr>
@@ -1657,10 +1757,17 @@
         </w:pBdr>
         <w:spacing w:after="0" w:line="240" w:lineRule="auto"/>
         <w:rPr>
-          <w:b/>
-          <w:bCs/>
-        </w:rPr>
-      </w:pPr>
+          <w:sz w:val="22"/>
+          <w:szCs w:val="22"/>
+        </w:rPr>
+      </w:pPr>
+      <w:r>
+        <w:rPr>
+          <w:sz w:val="22"/>
+          <w:szCs w:val="22"/>
+        </w:rPr>
+        <w:t>Kurukshetra University</w:t>
+      </w:r>
     </w:p>
     <w:p>
       <w:pPr>
@@ -1669,166 +1776,38 @@
         </w:pBdr>
         <w:spacing w:after="0" w:line="240" w:lineRule="auto"/>
         <w:rPr>
-          <w:b/>
-          <w:bCs/>
-        </w:rPr>
-      </w:pPr>
-      <w:r>
-        <w:rPr>
-          <w:b/>
-          <w:bCs/>
-        </w:rPr>
-        <w:t>Post Graduate Dip. In Computer Applications</w:t>
-      </w:r>
-    </w:p>
-    <w:p>
-      <w:pPr>
-        <w:pBdr>
-          <w:bottom w:val="dashed" w:sz="4" w:space="1" w:color="auto"/>
-        </w:pBdr>
-        <w:spacing w:after="0" w:line="240" w:lineRule="auto"/>
-        <w:rPr>
           <w:sz w:val="22"/>
           <w:szCs w:val="22"/>
         </w:rPr>
       </w:pPr>
+      <w:proofErr w:type="gramStart"/>
       <w:r>
         <w:rPr>
           <w:sz w:val="22"/>
           <w:szCs w:val="22"/>
         </w:rPr>
-        <w:t>Kurukshetra University</w:t>
-      </w:r>
-    </w:p>
-    <w:p>
-      <w:pPr>
-        <w:pBdr>
-          <w:bottom w:val="dashed" w:sz="4" w:space="1" w:color="auto"/>
-        </w:pBdr>
-        <w:spacing w:after="0" w:line="240" w:lineRule="auto"/>
+        <w:t>Year :</w:t>
+      </w:r>
+      <w:proofErr w:type="gramEnd"/>
+      <w:r>
         <w:rPr>
           <w:sz w:val="22"/>
           <w:szCs w:val="22"/>
         </w:rPr>
-      </w:pPr>
-      <w:proofErr w:type="gramStart"/>
+        <w:t xml:space="preserve"> </w:t>
+      </w:r>
       <w:r>
         <w:rPr>
           <w:sz w:val="22"/>
           <w:szCs w:val="22"/>
         </w:rPr>
-        <w:t>Year :</w:t>
-      </w:r>
-      <w:proofErr w:type="gramEnd"/>
+        <w:t>200</w:t>
+      </w:r>
       <w:r>
         <w:rPr>
           <w:sz w:val="22"/>
           <w:szCs w:val="22"/>
         </w:rPr>
-        <w:t xml:space="preserve"> </w:t>
-      </w:r>
-      <w:r>
-        <w:rPr>
-          <w:sz w:val="22"/>
-          <w:szCs w:val="22"/>
-        </w:rPr>
-        <w:t>200</w:t>
-      </w:r>
-      <w:r>
-        <w:rPr>
-          <w:sz w:val="22"/>
-          <w:szCs w:val="22"/>
-        </w:rPr>
-        <w:t>6</w:t>
-      </w:r>
-    </w:p>
-    <w:p>
-      <w:pPr>
-        <w:spacing w:after="0" w:line="240" w:lineRule="auto"/>
-        <w:rPr>
-          <w:sz w:val="22"/>
-          <w:szCs w:val="22"/>
-        </w:rPr>
-      </w:pPr>
-    </w:p>
-    <w:p>
-      <w:pPr>
-        <w:spacing w:after="0" w:line="240" w:lineRule="auto"/>
-        <w:rPr>
-          <w:b/>
-          <w:bCs/>
-          <w:sz w:val="26"/>
-          <w:szCs w:val="26"/>
-        </w:rPr>
-      </w:pPr>
-      <w:r>
-        <w:rPr>
-          <w:b/>
-          <w:bCs/>
-          <w:sz w:val="26"/>
-          <w:szCs w:val="26"/>
-        </w:rPr>
-        <w:t>M.Sc. in Computer Science</w:t>
-      </w:r>
-    </w:p>
-    <w:p>
-      <w:pPr>
-        <w:pBdr>
-          <w:bottom w:val="dashed" w:sz="4" w:space="1" w:color="auto"/>
-        </w:pBdr>
-        <w:spacing w:after="0" w:line="240" w:lineRule="auto"/>
-        <w:rPr>
-          <w:sz w:val="22"/>
-          <w:szCs w:val="22"/>
-        </w:rPr>
-      </w:pPr>
-      <w:r>
-        <w:rPr>
-          <w:sz w:val="22"/>
-          <w:szCs w:val="22"/>
-        </w:rPr>
-        <w:t>Kurukshetra University</w:t>
-      </w:r>
-    </w:p>
-    <w:p>
-      <w:pPr>
-        <w:pBdr>
-          <w:bottom w:val="dashed" w:sz="4" w:space="1" w:color="auto"/>
-        </w:pBdr>
-        <w:spacing w:after="0" w:line="240" w:lineRule="auto"/>
-        <w:rPr>
-          <w:sz w:val="22"/>
-          <w:szCs w:val="22"/>
-        </w:rPr>
-      </w:pPr>
-      <w:proofErr w:type="gramStart"/>
-      <w:r>
-        <w:rPr>
-          <w:sz w:val="22"/>
-          <w:szCs w:val="22"/>
-        </w:rPr>
-        <w:t>Year :</w:t>
-      </w:r>
-      <w:proofErr w:type="gramEnd"/>
-      <w:r>
-        <w:rPr>
-          <w:sz w:val="22"/>
-          <w:szCs w:val="22"/>
-        </w:rPr>
-        <w:t xml:space="preserve"> </w:t>
-      </w:r>
-      <w:r>
-        <w:rPr>
-          <w:sz w:val="22"/>
-          <w:szCs w:val="22"/>
-        </w:rPr>
-        <w:t>200</w:t>
-      </w:r>
-      <w:r>
-        <w:rPr>
-          <w:sz w:val="22"/>
-          <w:szCs w:val="22"/>
-        </w:rPr>
         <w:t>9</w:t>
       </w:r>
     </w:p>
@@ -1840,15 +1819,6 @@
           <w:bCs/>
           <w:sz w:val="28"/>
           <w:szCs w:val="28"/>
-        </w:rPr>
-      </w:pPr>
-    </w:p>
-    <w:p>
-      <w:pPr>
-        <w:spacing w:after="0" w:line="240" w:lineRule="auto"/>
-        <w:rPr>
-          <w:sz w:val="22"/>
-          <w:szCs w:val="22"/>
         </w:rPr>
       </w:pPr>
     </w:p>
@@ -2120,28 +2090,7 @@
           <w:sz w:val="20"/>
           <w:szCs w:val="20"/>
         </w:rPr>
-        <w:t>B</w:t>
-      </w:r>
-      <w:r>
-        <w:rPr>
-          <w:sz w:val="20"/>
-          <w:szCs w:val="20"/>
-        </w:rPr>
-        <w:t>rilliant</w:t>
-      </w:r>
-      <w:r>
-        <w:rPr>
-          <w:sz w:val="20"/>
-          <w:szCs w:val="20"/>
-        </w:rPr>
-        <w:t xml:space="preserve"> A</w:t>
-      </w:r>
-      <w:r>
-        <w:rPr>
-          <w:sz w:val="20"/>
-          <w:szCs w:val="20"/>
-        </w:rPr>
-        <w:t>venir</w:t>
+        <w:t>Brilliant Avenir</w:t>
       </w:r>
     </w:p>
     <w:p>
@@ -2346,30 +2295,515 @@
     </w:p>
     <w:p>
       <w:pPr>
-        <w:spacing w:after="0" w:line="240" w:lineRule="auto"/>
-        <w:rPr>
-          <w:sz w:val="20"/>
-          <w:szCs w:val="20"/>
-        </w:rPr>
-      </w:pPr>
-    </w:p>
-    <w:p>
-      <w:pPr>
-        <w:spacing w:after="0" w:line="240" w:lineRule="auto"/>
-        <w:rPr>
-          <w:sz w:val="20"/>
-          <w:szCs w:val="20"/>
-        </w:rPr>
-      </w:pPr>
-    </w:p>
-    <w:p>
-      <w:pPr>
-        <w:spacing w:after="0" w:line="240" w:lineRule="auto"/>
-        <w:rPr>
-          <w:sz w:val="20"/>
-          <w:szCs w:val="20"/>
-        </w:rPr>
-      </w:pPr>
+        <w:spacing w:after="0"/>
+        <w:rPr>
+          <w:b/>
+          <w:bCs/>
+          <w:sz w:val="28"/>
+          <w:szCs w:val="28"/>
+          <w:u w:val="single"/>
+        </w:rPr>
+      </w:pPr>
+    </w:p>
+    <w:p>
+      <w:pPr>
+        <w:spacing w:after="0"/>
+        <w:rPr>
+          <w:b/>
+          <w:bCs/>
+          <w:u w:val="single"/>
+        </w:rPr>
+      </w:pPr>
+      <w:r>
+        <w:rPr>
+          <w:b/>
+          <w:bCs/>
+          <w:sz w:val="28"/>
+          <w:szCs w:val="28"/>
+          <w:u w:val="single"/>
+        </w:rPr>
+        <w:t>P</w:t>
+      </w:r>
+      <w:r>
+        <w:rPr>
+          <w:b/>
+          <w:bCs/>
+          <w:sz w:val="28"/>
+          <w:szCs w:val="28"/>
+          <w:u w:val="single"/>
+        </w:rPr>
+        <w:t>ERSONAL INFORMATION</w:t>
+      </w:r>
+      <w:r>
+        <w:rPr>
+          <w:b/>
+          <w:bCs/>
+          <w:u w:val="single"/>
+        </w:rPr>
+        <w:tab/>
+      </w:r>
+      <w:r>
+        <w:rPr>
+          <w:b/>
+          <w:bCs/>
+          <w:u w:val="single"/>
+        </w:rPr>
+        <w:tab/>
+      </w:r>
+      <w:r>
+        <w:rPr>
+          <w:b/>
+          <w:bCs/>
+          <w:u w:val="single"/>
+        </w:rPr>
+        <w:tab/>
+      </w:r>
+      <w:r>
+        <w:rPr>
+          <w:b/>
+          <w:bCs/>
+          <w:u w:val="single"/>
+        </w:rPr>
+        <w:tab/>
+      </w:r>
+      <w:r>
+        <w:rPr>
+          <w:b/>
+          <w:bCs/>
+          <w:u w:val="single"/>
+        </w:rPr>
+        <w:tab/>
+      </w:r>
+      <w:r>
+        <w:rPr>
+          <w:b/>
+          <w:bCs/>
+          <w:u w:val="single"/>
+        </w:rPr>
+        <w:tab/>
+      </w:r>
+      <w:r>
+        <w:rPr>
+          <w:b/>
+          <w:bCs/>
+          <w:u w:val="single"/>
+        </w:rPr>
+        <w:tab/>
+      </w:r>
+      <w:r>
+        <w:rPr>
+          <w:b/>
+          <w:bCs/>
+          <w:u w:val="single"/>
+        </w:rPr>
+        <w:tab/>
+      </w:r>
+      <w:r>
+        <w:rPr>
+          <w:b/>
+          <w:bCs/>
+          <w:u w:val="single"/>
+        </w:rPr>
+        <w:tab/>
+      </w:r>
+      <w:r>
+        <w:rPr>
+          <w:b/>
+          <w:bCs/>
+          <w:u w:val="single"/>
+        </w:rPr>
+        <w:tab/>
+      </w:r>
+    </w:p>
+    <w:p>
+      <w:pPr>
+        <w:spacing w:after="0" w:line="240" w:lineRule="auto"/>
+        <w:rPr>
+          <w:sz w:val="20"/>
+          <w:szCs w:val="20"/>
+        </w:rPr>
+      </w:pPr>
+      <w:r>
+        <w:rPr>
+          <w:sz w:val="20"/>
+          <w:szCs w:val="20"/>
+        </w:rPr>
+        <w:t>Father’s Name</w:t>
+      </w:r>
+      <w:r>
+        <w:rPr>
+          <w:sz w:val="20"/>
+          <w:szCs w:val="20"/>
+        </w:rPr>
+        <w:tab/>
+      </w:r>
+      <w:r>
+        <w:rPr>
+          <w:sz w:val="20"/>
+          <w:szCs w:val="20"/>
+        </w:rPr>
+        <w:tab/>
+      </w:r>
+      <w:r>
+        <w:rPr>
+          <w:sz w:val="20"/>
+          <w:szCs w:val="20"/>
+        </w:rPr>
+        <w:tab/>
+      </w:r>
+      <w:r>
+        <w:rPr>
+          <w:sz w:val="20"/>
+          <w:szCs w:val="20"/>
+        </w:rPr>
+        <w:tab/>
+      </w:r>
+      <w:r>
+        <w:rPr>
+          <w:sz w:val="20"/>
+          <w:szCs w:val="20"/>
+        </w:rPr>
+        <w:tab/>
+      </w:r>
+      <w:r>
+        <w:rPr>
+          <w:sz w:val="20"/>
+          <w:szCs w:val="20"/>
+        </w:rPr>
+        <w:tab/>
+        <w:t>Sh. Om Parkash</w:t>
+      </w:r>
+    </w:p>
+    <w:p>
+      <w:pPr>
+        <w:spacing w:after="0" w:line="240" w:lineRule="auto"/>
+        <w:rPr>
+          <w:sz w:val="20"/>
+          <w:szCs w:val="20"/>
+        </w:rPr>
+      </w:pPr>
+      <w:r>
+        <w:rPr>
+          <w:sz w:val="20"/>
+          <w:szCs w:val="20"/>
+        </w:rPr>
+        <w:t>Date of Birth</w:t>
+      </w:r>
+      <w:r>
+        <w:rPr>
+          <w:sz w:val="20"/>
+          <w:szCs w:val="20"/>
+        </w:rPr>
+        <w:tab/>
+      </w:r>
+      <w:r>
+        <w:rPr>
+          <w:sz w:val="20"/>
+          <w:szCs w:val="20"/>
+        </w:rPr>
+        <w:tab/>
+      </w:r>
+      <w:r>
+        <w:rPr>
+          <w:sz w:val="20"/>
+          <w:szCs w:val="20"/>
+        </w:rPr>
+        <w:tab/>
+      </w:r>
+      <w:r>
+        <w:rPr>
+          <w:sz w:val="20"/>
+          <w:szCs w:val="20"/>
+        </w:rPr>
+        <w:tab/>
+      </w:r>
+      <w:r>
+        <w:rPr>
+          <w:sz w:val="20"/>
+          <w:szCs w:val="20"/>
+        </w:rPr>
+        <w:tab/>
+      </w:r>
+      <w:r>
+        <w:rPr>
+          <w:sz w:val="20"/>
+          <w:szCs w:val="20"/>
+        </w:rPr>
+        <w:tab/>
+        <w:t>23</w:t>
+      </w:r>
+      <w:r>
+        <w:rPr>
+          <w:sz w:val="20"/>
+          <w:szCs w:val="20"/>
+          <w:vertAlign w:val="superscript"/>
+        </w:rPr>
+        <w:t>rd</w:t>
+      </w:r>
+      <w:r>
+        <w:rPr>
+          <w:sz w:val="20"/>
+          <w:szCs w:val="20"/>
+        </w:rPr>
+        <w:t xml:space="preserve"> November 1983</w:t>
+      </w:r>
+    </w:p>
+    <w:p>
+      <w:pPr>
+        <w:spacing w:after="0" w:line="240" w:lineRule="auto"/>
+        <w:rPr>
+          <w:sz w:val="20"/>
+          <w:szCs w:val="20"/>
+        </w:rPr>
+      </w:pPr>
+      <w:r>
+        <w:rPr>
+          <w:sz w:val="20"/>
+          <w:szCs w:val="20"/>
+        </w:rPr>
+        <w:t>Marital Status</w:t>
+      </w:r>
+      <w:r>
+        <w:rPr>
+          <w:sz w:val="20"/>
+          <w:szCs w:val="20"/>
+        </w:rPr>
+        <w:tab/>
+      </w:r>
+      <w:r>
+        <w:rPr>
+          <w:sz w:val="20"/>
+          <w:szCs w:val="20"/>
+        </w:rPr>
+        <w:tab/>
+      </w:r>
+      <w:r>
+        <w:rPr>
+          <w:sz w:val="20"/>
+          <w:szCs w:val="20"/>
+        </w:rPr>
+        <w:tab/>
+      </w:r>
+      <w:r>
+        <w:rPr>
+          <w:sz w:val="20"/>
+          <w:szCs w:val="20"/>
+        </w:rPr>
+        <w:tab/>
+      </w:r>
+      <w:r>
+        <w:rPr>
+          <w:sz w:val="20"/>
+          <w:szCs w:val="20"/>
+        </w:rPr>
+        <w:tab/>
+      </w:r>
+      <w:r>
+        <w:rPr>
+          <w:sz w:val="20"/>
+          <w:szCs w:val="20"/>
+        </w:rPr>
+        <w:tab/>
+        <w:t>Married</w:t>
+      </w:r>
+    </w:p>
+    <w:p>
+      <w:pPr>
+        <w:spacing w:after="0" w:line="240" w:lineRule="auto"/>
+        <w:rPr>
+          <w:sz w:val="20"/>
+          <w:szCs w:val="20"/>
+        </w:rPr>
+      </w:pPr>
+      <w:r>
+        <w:rPr>
+          <w:sz w:val="20"/>
+          <w:szCs w:val="20"/>
+        </w:rPr>
+        <w:t>Nationality</w:t>
+      </w:r>
+      <w:r>
+        <w:rPr>
+          <w:sz w:val="20"/>
+          <w:szCs w:val="20"/>
+        </w:rPr>
+        <w:tab/>
+      </w:r>
+      <w:r>
+        <w:rPr>
+          <w:sz w:val="20"/>
+          <w:szCs w:val="20"/>
+        </w:rPr>
+        <w:tab/>
+      </w:r>
+      <w:r>
+        <w:rPr>
+          <w:sz w:val="20"/>
+          <w:szCs w:val="20"/>
+        </w:rPr>
+        <w:tab/>
+      </w:r>
+      <w:r>
+        <w:rPr>
+          <w:sz w:val="20"/>
+          <w:szCs w:val="20"/>
+        </w:rPr>
+        <w:tab/>
+      </w:r>
+      <w:r>
+        <w:rPr>
+          <w:sz w:val="20"/>
+          <w:szCs w:val="20"/>
+        </w:rPr>
+        <w:tab/>
+      </w:r>
+      <w:r>
+        <w:rPr>
+          <w:sz w:val="20"/>
+          <w:szCs w:val="20"/>
+        </w:rPr>
+        <w:tab/>
+        <w:t>Indian</w:t>
+      </w:r>
+    </w:p>
+    <w:p>
+      <w:pPr>
+        <w:spacing w:after="0" w:line="240" w:lineRule="auto"/>
+        <w:rPr>
+          <w:sz w:val="20"/>
+          <w:szCs w:val="20"/>
+        </w:rPr>
+      </w:pPr>
+    </w:p>
+    <w:p>
+      <w:pPr>
+        <w:spacing w:after="0" w:line="240" w:lineRule="auto"/>
+        <w:rPr>
+          <w:sz w:val="20"/>
+          <w:szCs w:val="20"/>
+        </w:rPr>
+      </w:pPr>
+    </w:p>
+    <w:p>
+      <w:pPr>
+        <w:tabs>
+          <w:tab w:val="left" w:pos="2756"/>
+          <w:tab w:val="left" w:pos="8696"/>
+        </w:tabs>
+        <w:spacing w:after="0"/>
+        <w:ind w:left="-144"/>
+        <w:jc w:val="both"/>
+        <w:rPr>
+          <w:rFonts w:eastAsia="Calibri" w:cstheme="majorHAnsi"/>
+          <w:b/>
+          <w:sz w:val="20"/>
+          <w:szCs w:val="20"/>
+        </w:rPr>
+      </w:pPr>
+      <w:r>
+        <w:rPr>
+          <w:rFonts w:asciiTheme="majorHAnsi" w:eastAsia="Calibri" w:hAnsiTheme="majorHAnsi" w:cstheme="majorHAnsi"/>
+          <w:b/>
+          <w:sz w:val="20"/>
+          <w:szCs w:val="20"/>
+        </w:rPr>
+        <w:t xml:space="preserve">   </w:t>
+      </w:r>
+      <w:r>
+        <w:rPr>
+          <w:rFonts w:eastAsia="Calibri" w:cstheme="majorHAnsi"/>
+          <w:b/>
+          <w:sz w:val="20"/>
+          <w:szCs w:val="20"/>
+        </w:rPr>
+        <w:t>DECLARATION:</w:t>
+      </w:r>
+    </w:p>
+    <w:p>
+      <w:pPr>
+        <w:spacing w:after="0" w:line="240" w:lineRule="auto"/>
+        <w:rPr>
+          <w:sz w:val="20"/>
+          <w:szCs w:val="20"/>
+        </w:rPr>
+      </w:pPr>
+      <w:r>
+        <w:rPr>
+          <w:rStyle w:val="apple-style-span"/>
+          <w:rFonts w:cstheme="minorHAnsi"/>
+          <w:sz w:val="20"/>
+          <w:szCs w:val="20"/>
+        </w:rPr>
+        <w:t xml:space="preserve">I hear by declare that </w:t>
+      </w:r>
+      <w:proofErr w:type="gramStart"/>
+      <w:r>
+        <w:rPr>
+          <w:rStyle w:val="apple-style-span"/>
+          <w:rFonts w:cstheme="minorHAnsi"/>
+          <w:sz w:val="20"/>
+          <w:szCs w:val="20"/>
+        </w:rPr>
+        <w:t>above</w:t>
+      </w:r>
+      <w:proofErr w:type="gramEnd"/>
+      <w:r>
+        <w:rPr>
+          <w:rStyle w:val="apple-style-span"/>
+          <w:rFonts w:cstheme="minorHAnsi"/>
+          <w:sz w:val="20"/>
+          <w:szCs w:val="20"/>
+        </w:rPr>
+        <w:t xml:space="preserve"> information is correct to my knowledge. I will be ever keen to get an opportunity in your esteemed organization &amp; will prove myself as a valuable asset for your organization</w:t>
+      </w:r>
+      <w:r>
+        <w:rPr>
+          <w:rFonts w:eastAsia="Calibri" w:cstheme="minorHAnsi"/>
+          <w:sz w:val="20"/>
+          <w:szCs w:val="20"/>
+        </w:rPr>
+        <w:t xml:space="preserve">                                                                      </w:t>
+      </w:r>
+      <w:r>
+        <w:rPr>
+          <w:rFonts w:eastAsia="Calibri" w:cstheme="minorHAnsi"/>
+          <w:sz w:val="20"/>
+          <w:szCs w:val="20"/>
+        </w:rPr>
+        <w:tab/>
+      </w:r>
+      <w:r>
+        <w:rPr>
+          <w:rFonts w:eastAsia="Calibri" w:cstheme="minorHAnsi"/>
+          <w:sz w:val="20"/>
+          <w:szCs w:val="20"/>
+        </w:rPr>
+        <w:tab/>
+      </w:r>
+      <w:r>
+        <w:rPr>
+          <w:rFonts w:eastAsia="Calibri" w:cstheme="minorHAnsi"/>
+          <w:sz w:val="20"/>
+          <w:szCs w:val="20"/>
+        </w:rPr>
+        <w:tab/>
+      </w:r>
+      <w:r>
+        <w:rPr>
+          <w:rFonts w:eastAsia="Calibri" w:cstheme="minorHAnsi"/>
+          <w:sz w:val="20"/>
+          <w:szCs w:val="20"/>
+        </w:rPr>
+        <w:tab/>
+      </w:r>
+      <w:r>
+        <w:rPr>
+          <w:rFonts w:eastAsia="Calibri" w:cstheme="minorHAnsi"/>
+          <w:sz w:val="20"/>
+          <w:szCs w:val="20"/>
+        </w:rPr>
+        <w:br/>
+      </w:r>
       <w:proofErr w:type="gramStart"/>
       <w:r>
         <w:rPr>
@@ -3340,6 +3774,7 @@
   <w:style w:type="character" w:default="1" w:styleId="DefaultParagraphFont">
     <w:name w:val="Default Paragraph Font"/>
     <w:uiPriority w:val="1"/>
+    <w:semiHidden/>
     <w:unhideWhenUsed/>
   </w:style>
   <w:style w:type="table" w:default="1" w:styleId="TableNormal">
@@ -3695,6 +4130,11 @@
       <w:shd w:val="clear" w:color="auto" w:fill="E1DFDD"/>
     </w:rPr>
   </w:style>
+  <w:style w:type="character" w:customStyle="1" w:styleId="apple-style-span">
+    <w:name w:val="apple-style-span"/>
+    <w:basedOn w:val="DefaultParagraphFont"/>
+    <w:rsid w:val="00CF7273"/>
+  </w:style>
 </w:styles>
 </file>
 

</xml_diff>